<commit_message>
v0.14 docs + circulation packet: execute the naked-interface deprecation
Reissues the full circulation set as v0.14 (the deprecation milestone Module 5
scheduled), footprint 131/60 -> 133/60, source digest 57aee1fd:

- ERRATA v0.13 -> v0.14 entry; MANIFEST_v0.14.txt; kernel-v0.14-build-audit.log
  (reproduced from CI run 29386970222, incl. the two new [propext] lines).
- AHC_VerifiedKernel_v0.14_Brief.{md,pdf,docx}: header reframed (v0.14
  completes Module 5's deprecation), Part II.G gains L10/L11 rows and the
  executed-deprecation paragraph, Part III D-6 updated, Part K v0.14 note,
  counts/digest throughout.
- module5/ map + amendment updated (deprecation executed) and re-rendered to
  PDF/DOCX.
- AHC-VerifiedKernel-v0.14-Circulation-Packet.zip: 50 files; packet-internal
  kernel digest verified == 57aee1fd; SHA256SUMS self-checks (41 files);
  PROVENANCE binds to commit 7e94319 + CI run 29386970222.
- README (root + kernel): v0.14, 133/60, digest, L10/L11 axiom split.
</commit_message>
<xml_diff>
--- a/docs/module5/CIRCULATION_AMENDMENT.docx
+++ b/docs/module5/CIRCULATION_AMENDMENT.docx
@@ -1968,58 +1968,7 @@
         <w:t xml:space="preserve"> </w:t>
       </w:r>
       <w:r>
-        <w:t xml:space="preserve">v0.13 ships the wrappers additively; the naked</w:t>
-      </w:r>
-      <w:r>
-        <w:t xml:space="preserve"> </w:t>
-      </w:r>
-      <w:r>
-        <w:rPr>
-          <w:rStyle w:val="VerbatimChar"/>
-        </w:rPr>
-        <w:t xml:space="preserve">EpInput</w:t>
-      </w:r>
-      <w:r>
-        <w:t xml:space="preserve"> </w:t>
-      </w:r>
-      <w:r>
-        <w:t xml:space="preserve">/</w:t>
-      </w:r>
-      <w:r>
-        <w:t xml:space="preserve"> </w:t>
-      </w:r>
-      <w:r>
-        <w:rPr>
-          <w:rStyle w:val="VerbatimChar"/>
-        </w:rPr>
-        <w:t xml:space="preserve">Envelope</w:t>
-      </w:r>
-      <w:r>
-        <w:t xml:space="preserve"> </w:t>
-      </w:r>
-      <w:r>
-        <w:t xml:space="preserve">/</w:t>
-      </w:r>
-      <w:r>
-        <w:t xml:space="preserve"> </w:t>
-      </w:r>
-      <w:r>
-        <w:rPr>
-          <w:rStyle w:val="VerbatimChar"/>
-        </w:rPr>
-        <w:t xml:space="preserve">Event</w:t>
-      </w:r>
-      <w:r>
-        <w:t xml:space="preserve"> </w:t>
-      </w:r>
-      <w:r>
-        <w:t xml:space="preserve">interfaces are marked deprecated with a</w:t>
-      </w:r>
-      <w:r>
-        <w:t xml:space="preserve"> </w:t>
-      </w:r>
-      <w:r>
-        <w:t xml:space="preserve">removal target of</w:t>
+        <w:t xml:space="preserve">v0.13 shipped the wrappers additively;</w:t>
       </w:r>
       <w:r>
         <w:t xml:space="preserve"> </w:t>
@@ -2029,22 +1978,133 @@
           <w:b/>
           <w:bCs/>
         </w:rPr>
-        <w:t xml:space="preserve">v0.14</w:t>
-      </w:r>
-      <w:r>
-        <w:t xml:space="preserve">. A preserved bypass is technical debt made</w:t>
-      </w:r>
-      <w:r>
-        <w:t xml:space="preserve"> </w:t>
-      </w:r>
-      <w:r>
-        <w:t xml:space="preserve">normative; retaining the naked interfaces this round keeps the 116 v0.12</w:t>
-      </w:r>
-      <w:r>
-        <w:t xml:space="preserve"> </w:t>
-      </w:r>
-      <w:r>
-        <w:t xml:space="preserve">theorems stable, and the gating migration is scheduled, not indefinite.</w:t>
+        <w:t xml:space="preserve">v0.14 executed the</w:t>
+      </w:r>
+      <w:r>
+        <w:rPr>
+          <w:b/>
+          <w:bCs/>
+        </w:rPr>
+        <w:t xml:space="preserve"> </w:t>
+      </w:r>
+      <w:r>
+        <w:rPr>
+          <w:b/>
+          <w:bCs/>
+        </w:rPr>
+        <w:t xml:space="preserve">deprecation.</w:t>
+      </w:r>
+      <w:r>
+        <w:t xml:space="preserve"> </w:t>
+      </w:r>
+      <w:r>
+        <w:t xml:space="preserve">The sanctioned issuing interface is now</w:t>
+      </w:r>
+      <w:r>
+        <w:t xml:space="preserve"> </w:t>
+      </w:r>
+      <w:r>
+        <w:rPr>
+          <w:rStyle w:val="VerbatimChar"/>
+        </w:rPr>
+        <w:t xml:space="preserve">seamStep</w:t>
+      </w:r>
+      <w:r>
+        <w:t xml:space="preserve"> </w:t>
+      </w:r>
+      <w:r>
+        <w:t xml:space="preserve">(the</w:t>
+      </w:r>
+      <w:r>
+        <w:t xml:space="preserve"> </w:t>
+      </w:r>
+      <w:r>
+        <w:t xml:space="preserve">episode machine driven through a</w:t>
+      </w:r>
+      <w:r>
+        <w:t xml:space="preserve"> </w:t>
+      </w:r>
+      <w:r>
+        <w:rPr>
+          <w:rStyle w:val="VerbatimChar"/>
+        </w:rPr>
+        <w:t xml:space="preserve">SeamClaim</w:t>
+      </w:r>
+      <w:r>
+        <w:t xml:space="preserve">), the naked issuing path is</w:t>
+      </w:r>
+      <w:r>
+        <w:t xml:space="preserve"> </w:t>
+      </w:r>
+      <w:r>
+        <w:rPr>
+          <w:rStyle w:val="VerbatimChar"/>
+        </w:rPr>
+        <w:t xml:space="preserve">@[deprecated seamStep]</w:t>
+      </w:r>
+      <w:r>
+        <w:t xml:space="preserve"> </w:t>
+      </w:r>
+      <w:r>
+        <w:t xml:space="preserve">in-code, and</w:t>
+      </w:r>
+      <w:r>
+        <w:t xml:space="preserve"> </w:t>
+      </w:r>
+      <w:r>
+        <w:rPr>
+          <w:b/>
+          <w:bCs/>
+        </w:rPr>
+        <w:t xml:space="preserve">L10–L11</w:t>
+      </w:r>
+      <w:r>
+        <w:t xml:space="preserve"> </w:t>
+      </w:r>
+      <w:r>
+        <w:t xml:space="preserve">prove the gate is total —</w:t>
+      </w:r>
+      <w:r>
+        <w:t xml:space="preserve"> </w:t>
+      </w:r>
+      <w:r>
+        <w:t xml:space="preserve">no unaccompanied bit initiates a fresh PIO from any state, and sanctioned</w:t>
+      </w:r>
+      <w:r>
+        <w:t xml:space="preserve"> </w:t>
+      </w:r>
+      <w:r>
+        <w:t xml:space="preserve">issuance implies a non-empty authorization chain and evidence. A preserved</w:t>
+      </w:r>
+      <w:r>
+        <w:t xml:space="preserve"> </w:t>
+      </w:r>
+      <w:r>
+        <w:t xml:space="preserve">bypass is technical debt made normative; the internal</w:t>
+      </w:r>
+      <w:r>
+        <w:t xml:space="preserve"> </w:t>
+      </w:r>
+      <w:r>
+        <w:rPr>
+          <w:rStyle w:val="VerbatimChar"/>
+        </w:rPr>
+        <w:t xml:space="preserve">estep</w:t>
+      </w:r>
+      <w:r>
+        <w:t xml:space="preserve">/</w:t>
+      </w:r>
+      <w:r>
+        <w:rPr>
+          <w:rStyle w:val="VerbatimChar"/>
+        </w:rPr>
+        <w:t xml:space="preserve">EpInput</w:t>
+      </w:r>
+      <w:r>
+        <w:t xml:space="preserve"> </w:t>
+      </w:r>
+      <w:r>
+        <w:t xml:space="preserve">remain undeprecated (the machine, not the bypass).</w:t>
       </w:r>
     </w:p>
     <w:p>

</xml_diff>